<commit_message>
Add FlowSat and DSAA signal-descriptor publication pages
</commit_message>
<xml_diff>
--- a/papers/exports/all_publications.docx
+++ b/papers/exports/all_publications.docx
@@ -27,11 +27,11 @@
         <w:jc w:val="center"/>
       </w:pPr>
       <w:r>
-        <w:t>Generated: 2026-05-18 09:22:17</w:t>
+        <w:t>Generated: 2026-09-20 18:03:43</w:t>
         <w:br/>
       </w:r>
       <w:r>
-        <w:t>Total Publications: 52</w:t>
+        <w:t>Total Publications: 54</w:t>
       </w:r>
     </w:p>
     <w:p>
@@ -171,6 +171,96 @@
       </w:r>
       <w:r>
         <w:t>10.1145/3744256.3812587</w:t>
+      </w:r>
+    </w:p>
+    <w:p/>
+    <w:p>
+      <w:r>
+        <w:rPr>
+          <w:b/>
+        </w:rPr>
+        <w:t>FlowSat: Flow-Matching Diffusion Transformers with Metadata Conditioning for Satellite Image Generation</w:t>
+      </w:r>
+    </w:p>
+    <w:p>
+      <w:r>
+        <w:rPr>
+          <w:b/>
+        </w:rPr>
+        <w:t xml:space="preserve">Authors: </w:t>
+      </w:r>
+      <w:r>
+        <w:t>Parihar, Digvijay Singh and Mondal, Rishabh and Batra, Nipun</w:t>
+      </w:r>
+    </w:p>
+    <w:p>
+      <w:r>
+        <w:rPr>
+          <w:b/>
+        </w:rPr>
+        <w:t xml:space="preserve">Venue: </w:t>
+      </w:r>
+      <w:r>
+        <w:rPr>
+          <w:i/>
+        </w:rPr>
+        <w:t>British Machine Vision Conference (BMVC)</w:t>
+      </w:r>
+    </w:p>
+    <w:p>
+      <w:r>
+        <w:rPr>
+          <w:b/>
+        </w:rPr>
+        <w:t xml:space="preserve">URL: </w:t>
+      </w:r>
+      <w:r>
+        <w:t>https://sustainability-lab.github.io/papers/2026/flowsat.html</w:t>
+      </w:r>
+    </w:p>
+    <w:p/>
+    <w:p>
+      <w:r>
+        <w:rPr>
+          <w:b/>
+        </w:rPr>
+        <w:t>Efficient Time Series SSL via Signal Descriptors</w:t>
+      </w:r>
+    </w:p>
+    <w:p>
+      <w:r>
+        <w:rPr>
+          <w:b/>
+        </w:rPr>
+        <w:t xml:space="preserve">Authors: </w:t>
+      </w:r>
+      <w:r>
+        <w:t>Thacker, Parv and Shrivastava, Ayush and Batra, Nipun</w:t>
+      </w:r>
+    </w:p>
+    <w:p>
+      <w:r>
+        <w:rPr>
+          <w:b/>
+        </w:rPr>
+        <w:t xml:space="preserve">Venue: </w:t>
+      </w:r>
+      <w:r>
+        <w:rPr>
+          <w:i/>
+        </w:rPr>
+        <w:t>IEEE International Conference on Data Science and Advanced Analytics (DSAA)</w:t>
+      </w:r>
+    </w:p>
+    <w:p>
+      <w:r>
+        <w:rPr>
+          <w:b/>
+        </w:rPr>
+        <w:t xml:space="preserve">URL: </w:t>
+      </w:r>
+      <w:r>
+        <w:t>https://sustainability-lab.github.io/papers/2026/signal-descriptors.html</w:t>
       </w:r>
     </w:p>
     <w:p/>

</xml_diff>

<commit_message>
Add FlowSat and DSAA signal-descriptor publication pages (#88)
</commit_message>
<xml_diff>
--- a/papers/exports/all_publications.docx
+++ b/papers/exports/all_publications.docx
@@ -27,11 +27,11 @@
         <w:jc w:val="center"/>
       </w:pPr>
       <w:r>
-        <w:t>Generated: 2026-05-18 09:22:17</w:t>
+        <w:t>Generated: 2026-09-20 18:03:43</w:t>
         <w:br/>
       </w:r>
       <w:r>
-        <w:t>Total Publications: 52</w:t>
+        <w:t>Total Publications: 54</w:t>
       </w:r>
     </w:p>
     <w:p>
@@ -171,6 +171,96 @@
       </w:r>
       <w:r>
         <w:t>10.1145/3744256.3812587</w:t>
+      </w:r>
+    </w:p>
+    <w:p/>
+    <w:p>
+      <w:r>
+        <w:rPr>
+          <w:b/>
+        </w:rPr>
+        <w:t>FlowSat: Flow-Matching Diffusion Transformers with Metadata Conditioning for Satellite Image Generation</w:t>
+      </w:r>
+    </w:p>
+    <w:p>
+      <w:r>
+        <w:rPr>
+          <w:b/>
+        </w:rPr>
+        <w:t xml:space="preserve">Authors: </w:t>
+      </w:r>
+      <w:r>
+        <w:t>Parihar, Digvijay Singh and Mondal, Rishabh and Batra, Nipun</w:t>
+      </w:r>
+    </w:p>
+    <w:p>
+      <w:r>
+        <w:rPr>
+          <w:b/>
+        </w:rPr>
+        <w:t xml:space="preserve">Venue: </w:t>
+      </w:r>
+      <w:r>
+        <w:rPr>
+          <w:i/>
+        </w:rPr>
+        <w:t>British Machine Vision Conference (BMVC)</w:t>
+      </w:r>
+    </w:p>
+    <w:p>
+      <w:r>
+        <w:rPr>
+          <w:b/>
+        </w:rPr>
+        <w:t xml:space="preserve">URL: </w:t>
+      </w:r>
+      <w:r>
+        <w:t>https://sustainability-lab.github.io/papers/2026/flowsat.html</w:t>
+      </w:r>
+    </w:p>
+    <w:p/>
+    <w:p>
+      <w:r>
+        <w:rPr>
+          <w:b/>
+        </w:rPr>
+        <w:t>Efficient Time Series SSL via Signal Descriptors</w:t>
+      </w:r>
+    </w:p>
+    <w:p>
+      <w:r>
+        <w:rPr>
+          <w:b/>
+        </w:rPr>
+        <w:t xml:space="preserve">Authors: </w:t>
+      </w:r>
+      <w:r>
+        <w:t>Thacker, Parv and Shrivastava, Ayush and Batra, Nipun</w:t>
+      </w:r>
+    </w:p>
+    <w:p>
+      <w:r>
+        <w:rPr>
+          <w:b/>
+        </w:rPr>
+        <w:t xml:space="preserve">Venue: </w:t>
+      </w:r>
+      <w:r>
+        <w:rPr>
+          <w:i/>
+        </w:rPr>
+        <w:t>IEEE International Conference on Data Science and Advanced Analytics (DSAA)</w:t>
+      </w:r>
+    </w:p>
+    <w:p>
+      <w:r>
+        <w:rPr>
+          <w:b/>
+        </w:rPr>
+        <w:t xml:space="preserve">URL: </w:t>
+      </w:r>
+      <w:r>
+        <w:t>https://sustainability-lab.github.io/papers/2026/signal-descriptors.html</w:t>
       </w:r>
     </w:p>
     <w:p/>

</xml_diff>